<commit_message>
Odisea: quinta parte (Nausícaa) y sexta parte (Esqueria), versiones finales con docx; guía de capítulos al día
Co-Authored-By: Claude Fable 5 <noreply@anthropic.com>
</commit_message>
<xml_diff>
--- a/odisea4_calipso.docx
+++ b/odisea4_calipso.docx
@@ -1811,7 +1811,7 @@
         <w:br/>
       </w:r>
       <w:r>
-        <w:t xml:space="preserve">Cada día tejía su mortaja, sólo para</w:t>
+        <w:t xml:space="preserve">Cada día tejía su mortaja, solo para</w:t>
       </w:r>
       <w:r>
         <w:br/>
@@ -2074,7 +2074,7 @@
         <w:br/>
       </w:r>
       <w:r>
-        <w:t xml:space="preserve">que tan sólo querían divertirse a tu costa.</w:t>
+        <w:t xml:space="preserve">que tan solo querían divertirse a tu costa.</w:t>
       </w:r>
       <w:r>
         <w:br/>
@@ -2122,7 +2122,7 @@
         <w:br/>
       </w:r>
       <w:r>
-        <w:t xml:space="preserve">como el mismísimo infierno que sólo por ella recorriste?</w:t>
+        <w:t xml:space="preserve">como el mismísimo infierno que solo por ella recorriste?</w:t>
       </w:r>
     </w:p>
     <w:p>

</xml_diff>